<commit_message>
Cite A1 patent applications and verify their own publication dates and PDF locations
</commit_message>
<xml_diff>
--- a/design/patent-prior-art-table-20261027/literature.docx
+++ b/design/patent-prior-art-table-20261027/literature.docx
@@ -43,7 +43,7 @@
           <w:b w:val="0"/>
           <w:i w:val="0"/>
         </w:rPr>
-        <w:t>共13项文献。专利位置按B2原始PDF定位；PDF页码从文件第1页起算，书内页码另注。</w:t>
+        <w:t>共13项文献。专利位置按A1原始PDF定位；PDF页码从文件第1页起算，书内页码另注。</w:t>
       </w:r>
     </w:p>
     <w:tbl>
@@ -212,7 +212,7 @@
                 <w:i w:val="0"/>
               </w:rPr>
               <w:br/>
-              <w:t>United States (US): US7716215B2; application publication: US20080177722A1</w:t>
+              <w:t>United States (US): US20080177722A1</w:t>
             </w:r>
           </w:p>
         </w:tc>
@@ -239,12 +239,6 @@
                 <w:i w:val="0"/>
               </w:rPr>
               <w:t>2008-07-24</w:t>
-              <w:br/>
-              <w:t>A1公开</w:t>
-              <w:br/>
-              <w:t>2010-05-11</w:t>
-              <w:br/>
-              <w:t>B2授权公告</w:t>
             </w:r>
           </w:p>
         </w:tc>
@@ -271,7 +265,7 @@
                   <w:b w:val="0"/>
                   <w:i w:val="0"/>
                 </w:rPr>
-                <w:t>https://patentimages.storage.googleapis.com/b1/07/18/edc8bbe72b0545/US7716215.pdf</w:t>
+                <w:t>https://patentimages.storage.googleapis.com/98/17/13/f551757d85a3c6/US20080177722A1.pdf</w:t>
               </w:r>
             </w:hyperlink>
           </w:p>
@@ -298,7 +292,7 @@
                 <w:b w:val="0"/>
                 <w:i w:val="0"/>
               </w:rPr>
-              <w:t>B2：PDF第21–25页（栏5–14）；第9页图7；第27–28页权利要求1。</w:t>
+              <w:t>PDF第20–24页；第8页图7。</w:t>
             </w:r>
           </w:p>
         </w:tc>
@@ -710,7 +704,7 @@
                 <w:i w:val="0"/>
               </w:rPr>
               <w:br/>
-              <w:t>United States (US): US11321317B2; application publication: US20170357692A1</w:t>
+              <w:t>United States (US): US20170357692A1</w:t>
             </w:r>
           </w:p>
         </w:tc>
@@ -737,12 +731,6 @@
                 <w:i w:val="0"/>
               </w:rPr>
               <w:t>2017-12-14</w:t>
-              <w:br/>
-              <w:t>A1公开</w:t>
-              <w:br/>
-              <w:t>2022-05-03</w:t>
-              <w:br/>
-              <w:t>B2授权公告</w:t>
             </w:r>
           </w:p>
         </w:tc>
@@ -769,7 +757,7 @@
                   <w:b w:val="0"/>
                   <w:i w:val="0"/>
                 </w:rPr>
-                <w:t>https://patentimages.storage.googleapis.com/cb/c7/fc/7708e63e84221e/US11321317.pdf</w:t>
+                <w:t>https://patentimages.storage.googleapis.com/d6/b3/46/ea4d370f789666/US20170357692A1.pdf</w:t>
               </w:r>
             </w:hyperlink>
           </w:p>
@@ -796,7 +784,7 @@
                 <w:b w:val="0"/>
                 <w:i w:val="0"/>
               </w:rPr>
-              <w:t>B2：PDF第14–15页；第3–4页图1–2；第18–20页；第6页图4；第31–32页权利要求1、7、10–12、16。</w:t>
+              <w:t>PDF第13–14页、第17–20页；第2–3页图1–2；第5页图4。</w:t>
             </w:r>
           </w:p>
         </w:tc>
@@ -1087,7 +1075,7 @@
                 <w:i w:val="0"/>
               </w:rPr>
               <w:br/>
-              <w:t>United States (US): US7493337B2; application publication: US20050222965A1</w:t>
+              <w:t>United States (US): US20050222965A1</w:t>
             </w:r>
           </w:p>
         </w:tc>
@@ -1114,12 +1102,6 @@
                 <w:i w:val="0"/>
               </w:rPr>
               <w:t>2005-10-06</w:t>
-              <w:br/>
-              <w:t>A1公开</w:t>
-              <w:br/>
-              <w:t>2009-02-17</w:t>
-              <w:br/>
-              <w:t>B2授权公告</w:t>
             </w:r>
           </w:p>
         </w:tc>
@@ -1146,7 +1128,7 @@
                   <w:b w:val="0"/>
                   <w:i w:val="0"/>
                 </w:rPr>
-                <w:t>https://patentimages.storage.googleapis.com/b8/cf/5c/890c5855ff3c28/US7493337.pdf</w:t>
+                <w:t>https://patentimages.storage.googleapis.com/4e/ca/94/ff92902d607fdb/US20050222965A1.pdf</w:t>
               </w:r>
             </w:hyperlink>
           </w:p>
@@ -1173,7 +1155,7 @@
                 <w:b w:val="0"/>
                 <w:i w:val="0"/>
               </w:rPr>
-              <w:t>B2：PDF第20–21页；第13页图12；第24–25页权利要求22–33、42。</w:t>
+              <w:t>PDF第19–20页；第12页图12。</w:t>
             </w:r>
           </w:p>
         </w:tc>

</xml_diff>

<commit_message>
Use compact linked labels in prior-art source column
</commit_message>
<xml_diff>
--- a/design/patent-prior-art-table-20261027/literature.docx
+++ b/design/patent-prior-art-table-20261027/literature.docx
@@ -57,7 +57,7 @@
       <w:tblGrid>
         <w:gridCol w:w="6480"/>
         <w:gridCol w:w="1728"/>
-        <w:gridCol w:w="3600"/>
+        <w:gridCol w:w="1440"/>
         <w:gridCol w:w="3312"/>
       </w:tblGrid>
       <w:tr>
@@ -121,8 +121,8 @@
         </w:tc>
         <w:tc>
           <w:tcPr>
-            <w:tcW w:type="dxa" w:w="3600"/>
-            <w:vAlign w:val="top"/>
+            <w:tcW w:type="dxa" w:w="1440"/>
+            <w:vAlign w:val="center"/>
             <w:shd w:fill="F2F2F2"/>
           </w:tcPr>
           <w:p>
@@ -132,6 +132,7 @@
               <w:ind w:firstLine="0" w:firstLineChars="0"/>
               <w:autoSpaceDE w:val="0"/>
               <w:autoSpaceDN w:val="0"/>
+              <w:jc w:val="center"/>
             </w:pPr>
             <w:r>
               <w:rPr>
@@ -244,8 +245,8 @@
         </w:tc>
         <w:tc>
           <w:tcPr>
-            <w:tcW w:type="dxa" w:w="3600"/>
-            <w:vAlign w:val="top"/>
+            <w:tcW w:type="dxa" w:w="1440"/>
+            <w:vAlign w:val="center"/>
           </w:tcPr>
           <w:p>
             <w:pPr>
@@ -254,6 +255,7 @@
               <w:ind w:firstLine="0" w:firstLineChars="0"/>
               <w:autoSpaceDE w:val="0"/>
               <w:autoSpaceDN w:val="0"/>
+              <w:jc w:val="center"/>
             </w:pPr>
             <w:hyperlink r:id="rId10">
               <w:r>
@@ -264,8 +266,10 @@
                   <w:color w:val="000000"/>
                   <w:b w:val="0"/>
                   <w:i w:val="0"/>
+                  <w:color w:val="315B78"/>
+                  <w:u w:val="single"/>
                 </w:rPr>
-                <w:t>https://patentimages.storage.googleapis.com/98/17/13/f551757d85a3c6/US20080177722A1.pdf</w:t>
+                <w:t>原文PDF</w:t>
               </w:r>
             </w:hyperlink>
           </w:p>
@@ -367,8 +371,8 @@
         </w:tc>
         <w:tc>
           <w:tcPr>
-            <w:tcW w:type="dxa" w:w="3600"/>
-            <w:vAlign w:val="top"/>
+            <w:tcW w:type="dxa" w:w="1440"/>
+            <w:vAlign w:val="center"/>
           </w:tcPr>
           <w:p>
             <w:pPr>
@@ -377,6 +381,7 @@
               <w:ind w:firstLine="0" w:firstLineChars="0"/>
               <w:autoSpaceDE w:val="0"/>
               <w:autoSpaceDN w:val="0"/>
+              <w:jc w:val="center"/>
             </w:pPr>
             <w:hyperlink r:id="rId11">
               <w:r>
@@ -387,8 +392,10 @@
                   <w:color w:val="000000"/>
                   <w:b w:val="0"/>
                   <w:i w:val="0"/>
+                  <w:color w:val="315B78"/>
+                  <w:u w:val="single"/>
                 </w:rPr>
-                <w:t>https://www.vldb.org/conf/2001/P019.pdf</w:t>
+                <w:t>原文PDF</w:t>
               </w:r>
             </w:hyperlink>
           </w:p>
@@ -490,8 +497,8 @@
         </w:tc>
         <w:tc>
           <w:tcPr>
-            <w:tcW w:type="dxa" w:w="3600"/>
-            <w:vAlign w:val="top"/>
+            <w:tcW w:type="dxa" w:w="1440"/>
+            <w:vAlign w:val="center"/>
           </w:tcPr>
           <w:p>
             <w:pPr>
@@ -500,6 +507,7 @@
               <w:ind w:firstLine="0" w:firstLineChars="0"/>
               <w:autoSpaceDE w:val="0"/>
               <w:autoSpaceDN w:val="0"/>
+              <w:jc w:val="center"/>
             </w:pPr>
             <w:hyperlink r:id="rId12">
               <w:r>
@@ -510,8 +518,10 @@
                   <w:color w:val="000000"/>
                   <w:b w:val="0"/>
                   <w:i w:val="0"/>
+                  <w:color w:val="315B78"/>
+                  <w:u w:val="single"/>
                 </w:rPr>
-                <w:t>https://dsf.berkeley.edu/cs286/papers/robust-sigmod2004.pdf</w:t>
+                <w:t>原文PDF</w:t>
               </w:r>
             </w:hyperlink>
           </w:p>
@@ -613,8 +623,8 @@
         </w:tc>
         <w:tc>
           <w:tcPr>
-            <w:tcW w:type="dxa" w:w="3600"/>
-            <w:vAlign w:val="top"/>
+            <w:tcW w:type="dxa" w:w="1440"/>
+            <w:vAlign w:val="center"/>
           </w:tcPr>
           <w:p>
             <w:pPr>
@@ -623,6 +633,7 @@
               <w:ind w:firstLine="0" w:firstLineChars="0"/>
               <w:autoSpaceDE w:val="0"/>
               <w:autoSpaceDN w:val="0"/>
+              <w:jc w:val="center"/>
             </w:pPr>
             <w:hyperlink r:id="rId13">
               <w:r>
@@ -633,8 +644,10 @@
                   <w:color w:val="000000"/>
                   <w:b w:val="0"/>
                   <w:i w:val="0"/>
+                  <w:color w:val="315B78"/>
+                  <w:u w:val="single"/>
                 </w:rPr>
-                <w:t>https://www.vldb.org/conf/2004/DEMP22.PDF</w:t>
+                <w:t>原文PDF</w:t>
               </w:r>
             </w:hyperlink>
           </w:p>
@@ -736,8 +749,8 @@
         </w:tc>
         <w:tc>
           <w:tcPr>
-            <w:tcW w:type="dxa" w:w="3600"/>
-            <w:vAlign w:val="top"/>
+            <w:tcW w:type="dxa" w:w="1440"/>
+            <w:vAlign w:val="center"/>
           </w:tcPr>
           <w:p>
             <w:pPr>
@@ -746,6 +759,7 @@
               <w:ind w:firstLine="0" w:firstLineChars="0"/>
               <w:autoSpaceDE w:val="0"/>
               <w:autoSpaceDN w:val="0"/>
+              <w:jc w:val="center"/>
             </w:pPr>
             <w:hyperlink r:id="rId14">
               <w:r>
@@ -756,8 +770,10 @@
                   <w:color w:val="000000"/>
                   <w:b w:val="0"/>
                   <w:i w:val="0"/>
+                  <w:color w:val="315B78"/>
+                  <w:u w:val="single"/>
                 </w:rPr>
-                <w:t>https://patentimages.storage.googleapis.com/d6/b3/46/ea4d370f789666/US20170357692A1.pdf</w:t>
+                <w:t>原文PDF</w:t>
               </w:r>
             </w:hyperlink>
           </w:p>
@@ -859,8 +875,8 @@
         </w:tc>
         <w:tc>
           <w:tcPr>
-            <w:tcW w:type="dxa" w:w="3600"/>
-            <w:vAlign w:val="top"/>
+            <w:tcW w:type="dxa" w:w="1440"/>
+            <w:vAlign w:val="center"/>
           </w:tcPr>
           <w:p>
             <w:pPr>
@@ -869,6 +885,7 @@
               <w:ind w:firstLine="0" w:firstLineChars="0"/>
               <w:autoSpaceDE w:val="0"/>
               <w:autoSpaceDN w:val="0"/>
+              <w:jc w:val="center"/>
             </w:pPr>
             <w:hyperlink r:id="rId15">
               <w:r>
@@ -879,8 +896,10 @@
                   <w:color w:val="000000"/>
                   <w:b w:val="0"/>
                   <w:i w:val="0"/>
+                  <w:color w:val="315B78"/>
+                  <w:u w:val="single"/>
                 </w:rPr>
-                <w:t>https://www.vldb.org/pvldb/vol10/p1813-zait.pdf</w:t>
+                <w:t>原文PDF</w:t>
               </w:r>
             </w:hyperlink>
           </w:p>
@@ -984,8 +1003,8 @@
         </w:tc>
         <w:tc>
           <w:tcPr>
-            <w:tcW w:type="dxa" w:w="3600"/>
-            <w:vAlign w:val="top"/>
+            <w:tcW w:type="dxa" w:w="1440"/>
+            <w:vAlign w:val="center"/>
           </w:tcPr>
           <w:p>
             <w:pPr>
@@ -994,6 +1013,7 @@
               <w:ind w:firstLine="0" w:firstLineChars="0"/>
               <w:autoSpaceDE w:val="0"/>
               <w:autoSpaceDN w:val="0"/>
+              <w:jc w:val="center"/>
             </w:pPr>
             <w:hyperlink r:id="rId16">
               <w:r>
@@ -1004,8 +1024,10 @@
                   <w:color w:val="000000"/>
                   <w:b w:val="0"/>
                   <w:i w:val="0"/>
+                  <w:color w:val="315B78"/>
+                  <w:u w:val="single"/>
                 </w:rPr>
-                <w:t>https://docs.oracle.com/database/121/TGSQL/E49106-14.pdf</w:t>
+                <w:t>原文PDF</w:t>
               </w:r>
             </w:hyperlink>
           </w:p>
@@ -1107,8 +1129,8 @@
         </w:tc>
         <w:tc>
           <w:tcPr>
-            <w:tcW w:type="dxa" w:w="3600"/>
-            <w:vAlign w:val="top"/>
+            <w:tcW w:type="dxa" w:w="1440"/>
+            <w:vAlign w:val="center"/>
           </w:tcPr>
           <w:p>
             <w:pPr>
@@ -1117,6 +1139,7 @@
               <w:ind w:firstLine="0" w:firstLineChars="0"/>
               <w:autoSpaceDE w:val="0"/>
               <w:autoSpaceDN w:val="0"/>
+              <w:jc w:val="center"/>
             </w:pPr>
             <w:hyperlink r:id="rId17">
               <w:r>
@@ -1127,8 +1150,10 @@
                   <w:color w:val="000000"/>
                   <w:b w:val="0"/>
                   <w:i w:val="0"/>
+                  <w:color w:val="315B78"/>
+                  <w:u w:val="single"/>
                 </w:rPr>
-                <w:t>https://patentimages.storage.googleapis.com/4e/ca/94/ff92902d607fdb/US20050222965A1.pdf</w:t>
+                <w:t>原文PDF</w:t>
               </w:r>
             </w:hyperlink>
           </w:p>
@@ -1230,8 +1255,8 @@
         </w:tc>
         <w:tc>
           <w:tcPr>
-            <w:tcW w:type="dxa" w:w="3600"/>
-            <w:vAlign w:val="top"/>
+            <w:tcW w:type="dxa" w:w="1440"/>
+            <w:vAlign w:val="center"/>
           </w:tcPr>
           <w:p>
             <w:pPr>
@@ -1240,6 +1265,7 @@
               <w:ind w:firstLine="0" w:firstLineChars="0"/>
               <w:autoSpaceDE w:val="0"/>
               <w:autoSpaceDN w:val="0"/>
+              <w:jc w:val="center"/>
             </w:pPr>
             <w:hyperlink r:id="rId18">
               <w:r>
@@ -1250,8 +1276,10 @@
                   <w:color w:val="000000"/>
                   <w:b w:val="0"/>
                   <w:i w:val="0"/>
+                  <w:color w:val="315B78"/>
+                  <w:u w:val="single"/>
                 </w:rPr>
-                <w:t>https://www.microsoft.com/en-us/research/wp-content/uploads/2016/02/progress-1.pdf</w:t>
+                <w:t>原文PDF</w:t>
               </w:r>
             </w:hyperlink>
           </w:p>
@@ -1353,8 +1381,8 @@
         </w:tc>
         <w:tc>
           <w:tcPr>
-            <w:tcW w:type="dxa" w:w="3600"/>
-            <w:vAlign w:val="top"/>
+            <w:tcW w:type="dxa" w:w="1440"/>
+            <w:vAlign w:val="center"/>
           </w:tcPr>
           <w:p>
             <w:pPr>
@@ -1363,6 +1391,7 @@
               <w:ind w:firstLine="0" w:firstLineChars="0"/>
               <w:autoSpaceDE w:val="0"/>
               <w:autoSpaceDN w:val="0"/>
+              <w:jc w:val="center"/>
             </w:pPr>
             <w:hyperlink r:id="rId19">
               <w:r>
@@ -1373,8 +1402,10 @@
                   <w:color w:val="000000"/>
                   <w:b w:val="0"/>
                   <w:i w:val="0"/>
+                  <w:color w:val="315B78"/>
+                  <w:u w:val="single"/>
                 </w:rPr>
-                <w:t>https://www.microsoft.com/en-us/research/wp-content/uploads/2016/06/qprog.pdf</w:t>
+                <w:t>原文PDF</w:t>
               </w:r>
             </w:hyperlink>
           </w:p>
@@ -1478,8 +1509,8 @@
         </w:tc>
         <w:tc>
           <w:tcPr>
-            <w:tcW w:type="dxa" w:w="3600"/>
-            <w:vAlign w:val="top"/>
+            <w:tcW w:type="dxa" w:w="1440"/>
+            <w:vAlign w:val="center"/>
           </w:tcPr>
           <w:p>
             <w:pPr>
@@ -1488,6 +1519,7 @@
               <w:ind w:firstLine="0" w:firstLineChars="0"/>
               <w:autoSpaceDE w:val="0"/>
               <w:autoSpaceDN w:val="0"/>
+              <w:jc w:val="center"/>
             </w:pPr>
             <w:hyperlink r:id="rId20">
               <w:r>
@@ -1498,8 +1530,10 @@
                   <w:color w:val="000000"/>
                   <w:b w:val="0"/>
                   <w:i w:val="0"/>
+                  <w:color w:val="315B78"/>
+                  <w:u w:val="single"/>
                 </w:rPr>
-                <w:t>https://learn.microsoft.com/en-us/sql/relational-databases/performance/live-query-statistics?view=sql-server-ver17</w:t>
+                <w:t>官方文档</w:t>
               </w:r>
             </w:hyperlink>
           </w:p>
@@ -1603,8 +1637,8 @@
         </w:tc>
         <w:tc>
           <w:tcPr>
-            <w:tcW w:type="dxa" w:w="3600"/>
-            <w:vAlign w:val="top"/>
+            <w:tcW w:type="dxa" w:w="1440"/>
+            <w:vAlign w:val="center"/>
           </w:tcPr>
           <w:p>
             <w:pPr>
@@ -1613,6 +1647,7 @@
               <w:ind w:firstLine="0" w:firstLineChars="0"/>
               <w:autoSpaceDE w:val="0"/>
               <w:autoSpaceDN w:val="0"/>
+              <w:jc w:val="center"/>
             </w:pPr>
             <w:hyperlink r:id="rId21">
               <w:r>
@@ -1623,8 +1658,10 @@
                   <w:color w:val="000000"/>
                   <w:b w:val="0"/>
                   <w:i w:val="0"/>
+                  <w:color w:val="315B78"/>
+                  <w:u w:val="single"/>
                 </w:rPr>
-                <w:t>https://learn.microsoft.com/en-us/sql/relational-databases/system-dynamic-management-objects/sys-dm-exec-query-profiles-transact-sql?view=sql-server-ver17</w:t>
+                <w:t>官方文档</w:t>
               </w:r>
             </w:hyperlink>
           </w:p>
@@ -1728,8 +1765,8 @@
         </w:tc>
         <w:tc>
           <w:tcPr>
-            <w:tcW w:type="dxa" w:w="3600"/>
-            <w:vAlign w:val="top"/>
+            <w:tcW w:type="dxa" w:w="1440"/>
+            <w:vAlign w:val="center"/>
           </w:tcPr>
           <w:p>
             <w:pPr>
@@ -1738,6 +1775,7 @@
               <w:ind w:firstLine="0" w:firstLineChars="0"/>
               <w:autoSpaceDE w:val="0"/>
               <w:autoSpaceDN w:val="0"/>
+              <w:jc w:val="center"/>
             </w:pPr>
             <w:hyperlink r:id="rId22">
               <w:r>
@@ -1748,8 +1786,10 @@
                   <w:color w:val="000000"/>
                   <w:b w:val="0"/>
                   <w:i w:val="0"/>
+                  <w:color w:val="315B78"/>
+                  <w:u w:val="single"/>
                 </w:rPr>
-                <w:t>https://learn.microsoft.com/en-us/sql/relational-databases/showplan-logical-and-physical-operators-reference?view=sql-server-ver17</w:t>
+                <w:t>官方文档</w:t>
               </w:r>
             </w:hyperlink>
           </w:p>

</xml_diff>

<commit_message>
Format patent publication dates by year and month
</commit_message>
<xml_diff>
--- a/design/patent-prior-art-table-20261027/literature.docx
+++ b/design/patent-prior-art-table-20261027/literature.docx
@@ -239,7 +239,7 @@
                 <w:b w:val="0"/>
                 <w:i w:val="0"/>
               </w:rPr>
-              <w:t>2008-07-24</w:t>
+              <w:t>2008-07</w:t>
             </w:r>
           </w:p>
         </w:tc>
@@ -743,7 +743,7 @@
                 <w:b w:val="0"/>
                 <w:i w:val="0"/>
               </w:rPr>
-              <w:t>2017-12-14</w:t>
+              <w:t>2017-12</w:t>
             </w:r>
           </w:p>
         </w:tc>
@@ -1123,7 +1123,7 @@
                 <w:b w:val="0"/>
                 <w:i w:val="0"/>
               </w:rPr>
-              <w:t>2005-10-06</w:t>
+              <w:t>2005-10</w:t>
             </w:r>
           </w:p>
         </w:tc>

</xml_diff>